<commit_message>
chore: rebuild dist, update .env, add .kilo config
</commit_message>
<xml_diff>
--- a/dist/template_daftar_hadir.docx
+++ b/dist/template_daftar_hadir.docx
@@ -226,7 +226,6 @@
           <w:lang w:val="en-US"/>
         </w:rPr>
         <w:tab/>
-        <w:t/>
       </w:r>
       <w:r>
         <w:rPr>
@@ -236,10 +235,7 @@
           <w:lang w:val="en-US"/>
         </w:rPr>
         <w:tab/>
-        <w:t>: {kelas</w:t>
       </w:r>
-      <w:bookmarkStart w:id="0" w:name="_GoBack"/>
-      <w:bookmarkEnd w:id="0"/>
       <w:r>
         <w:rPr>
           <w:rFonts w:hint="default"/>
@@ -247,7 +243,7 @@
           <w:szCs w:val="22"/>
           <w:lang w:val="en-US"/>
         </w:rPr>
-        <w:t>}</w:t>
+        <w:t>: {kelas}</w:t>
       </w:r>
     </w:p>
     <w:p>
@@ -626,7 +622,7 @@
                 <w:rFonts w:hint="default"/>
                 <w:lang w:val="en-US"/>
               </w:rPr>
-              <w:t>Panitia</w:t>
+              <w:t>Ketua Panitia</w:t>
             </w:r>
           </w:p>
         </w:tc>
@@ -730,6 +726,126 @@
                 <w:lang w:val="en-US"/>
               </w:rPr>
             </w:pPr>
+          </w:p>
+        </w:tc>
+      </w:tr>
+      <w:tr>
+        <w:tblPrEx>
+          <w:tblBorders>
+            <w:top w:val="none" w:color="auto" w:sz="0" w:space="0"/>
+            <w:left w:val="none" w:color="auto" w:sz="0" w:space="0"/>
+            <w:bottom w:val="none" w:color="auto" w:sz="0" w:space="0"/>
+            <w:right w:val="none" w:color="auto" w:sz="0" w:space="0"/>
+            <w:insideH w:val="none" w:color="auto" w:sz="0" w:space="0"/>
+            <w:insideV w:val="none" w:color="auto" w:sz="0" w:space="0"/>
+          </w:tblBorders>
+          <w:tblCellMar>
+            <w:top w:w="0" w:type="dxa"/>
+            <w:left w:w="108" w:type="dxa"/>
+            <w:bottom w:w="0" w:type="dxa"/>
+            <w:right w:w="108" w:type="dxa"/>
+          </w:tblCellMar>
+        </w:tblPrEx>
+        <w:tc>
+          <w:tcPr>
+            <w:tcW w:w="4085" w:type="dxa"/>
+          </w:tcPr>
+          <w:p>
+            <w:pPr>
+              <w:widowControl w:val="0"/>
+              <w:jc w:val="both"/>
+              <w:rPr>
+                <w:rFonts w:hint="default"/>
+                <w:vertAlign w:val="baseline"/>
+                <w:lang w:val="en-US"/>
+              </w:rPr>
+            </w:pPr>
+          </w:p>
+        </w:tc>
+      </w:tr>
+      <w:tr>
+        <w:tblPrEx>
+          <w:tblBorders>
+            <w:top w:val="none" w:color="auto" w:sz="0" w:space="0"/>
+            <w:left w:val="none" w:color="auto" w:sz="0" w:space="0"/>
+            <w:bottom w:val="none" w:color="auto" w:sz="0" w:space="0"/>
+            <w:right w:val="none" w:color="auto" w:sz="0" w:space="0"/>
+            <w:insideH w:val="none" w:color="auto" w:sz="0" w:space="0"/>
+            <w:insideV w:val="none" w:color="auto" w:sz="0" w:space="0"/>
+          </w:tblBorders>
+          <w:tblCellMar>
+            <w:top w:w="0" w:type="dxa"/>
+            <w:left w:w="108" w:type="dxa"/>
+            <w:bottom w:w="0" w:type="dxa"/>
+            <w:right w:w="108" w:type="dxa"/>
+          </w:tblCellMar>
+        </w:tblPrEx>
+        <w:tc>
+          <w:tcPr>
+            <w:tcW w:w="4085" w:type="dxa"/>
+          </w:tcPr>
+          <w:p>
+            <w:pPr>
+              <w:widowControl w:val="0"/>
+              <w:jc w:val="both"/>
+              <w:rPr>
+                <w:rFonts w:hint="default"/>
+                <w:vertAlign w:val="baseline"/>
+                <w:lang w:val="en-US"/>
+              </w:rPr>
+            </w:pPr>
+            <w:r>
+              <w:rPr>
+                <w:rFonts w:hint="default"/>
+                <w:vertAlign w:val="baseline"/>
+                <w:lang w:val="en-US"/>
+              </w:rPr>
+              <w:t>{ketua_panitia}</w:t>
+            </w:r>
+          </w:p>
+        </w:tc>
+      </w:tr>
+      <w:tr>
+        <w:tblPrEx>
+          <w:tblBorders>
+            <w:top w:val="none" w:color="auto" w:sz="0" w:space="0"/>
+            <w:left w:val="none" w:color="auto" w:sz="0" w:space="0"/>
+            <w:bottom w:val="none" w:color="auto" w:sz="0" w:space="0"/>
+            <w:right w:val="none" w:color="auto" w:sz="0" w:space="0"/>
+            <w:insideH w:val="none" w:color="auto" w:sz="0" w:space="0"/>
+            <w:insideV w:val="none" w:color="auto" w:sz="0" w:space="0"/>
+          </w:tblBorders>
+          <w:tblCellMar>
+            <w:top w:w="0" w:type="dxa"/>
+            <w:left w:w="108" w:type="dxa"/>
+            <w:bottom w:w="0" w:type="dxa"/>
+            <w:right w:w="108" w:type="dxa"/>
+          </w:tblCellMar>
+        </w:tblPrEx>
+        <w:tc>
+          <w:tcPr>
+            <w:tcW w:w="4085" w:type="dxa"/>
+          </w:tcPr>
+          <w:p>
+            <w:pPr>
+              <w:widowControl w:val="0"/>
+              <w:jc w:val="both"/>
+              <w:rPr>
+                <w:rFonts w:hint="default"/>
+                <w:vertAlign w:val="baseline"/>
+                <w:lang w:val="en-US"/>
+              </w:rPr>
+            </w:pPr>
+            <w:r>
+              <w:rPr>
+                <w:rFonts w:hint="default"/>
+                <w:vertAlign w:val="baseline"/>
+                <w:lang w:val="en-US"/>
+              </w:rPr>
+              <w:t>NIP {nip}</w:t>
+            </w:r>
+            <w:bookmarkStart w:id="0" w:name="_GoBack"/>
+            <w:bookmarkEnd w:id="0"/>
           </w:p>
         </w:tc>
       </w:tr>

</xml_diff>